<commit_message>
docs: update computerised project report documentation
</commit_message>
<xml_diff>
--- a/Computerised.docx
+++ b/Computerised.docx
@@ -5861,6 +5861,86 @@
     </w:p>
     <w:p>
       <w:pPr>
+        <w:pStyle w:val="Normal"/>
+      </w:pPr>
+      <w:r>
+        <w:t>Multi-organization management and setup</w:t>
+      </w:r>
+    </w:p>
+    <w:p>
+      <w:pPr>
+        <w:pStyle w:val="Normal"/>
+      </w:pPr>
+      <w:r>
+        <w:t>Role-based access control (Administrator and Receptionist roles)</w:t>
+      </w:r>
+    </w:p>
+    <w:p>
+      <w:pPr>
+        <w:pStyle w:val="Normal"/>
+      </w:pPr>
+      <w:r>
+        <w:t>Visitor pass and QR-code badge generation</w:t>
+      </w:r>
+    </w:p>
+    <w:p>
+      <w:pPr>
+        <w:pStyle w:val="Normal"/>
+      </w:pPr>
+      <w:r>
+        <w:t>Dynamic visitor registration form builder</w:t>
+      </w:r>
+    </w:p>
+    <w:p>
+      <w:pPr>
+        <w:pStyle w:val="Normal"/>
+      </w:pPr>
+      <w:r>
+        <w:t>Live real-time presence tracking board</w:t>
+      </w:r>
+    </w:p>
+    <w:p>
+      <w:pPr>
+        <w:pStyle w:val="Normal"/>
+      </w:pPr>
+      <w:r>
+        <w:t>Departments and host staff directory</w:t>
+      </w:r>
+    </w:p>
+    <w:p>
+      <w:pPr>
+        <w:pStyle w:val="Normal"/>
+      </w:pPr>
+      <w:r>
+        <w:t>Advanced analytics and time-filtered reporting</w:t>
+      </w:r>
+    </w:p>
+    <w:p>
+      <w:pPr>
+        <w:pStyle w:val="Normal"/>
+      </w:pPr>
+      <w:r>
+        <w:t>Audit log and system activity tracking</w:t>
+      </w:r>
+    </w:p>
+    <w:p>
+      <w:pPr>
+        <w:pStyle w:val="Normal"/>
+      </w:pPr>
+      <w:r>
+        <w:t>Keyboard command palette</w:t>
+      </w:r>
+    </w:p>
+    <w:p>
+      <w:pPr>
+        <w:pStyle w:val="Normal"/>
+      </w:pPr>
+      <w:r>
+        <w:t>Dark and light mode interface theming</w:t>
+      </w:r>
+    </w:p>
+    <w:p>
+      <w:pPr>
         <w:spacing w:after="240" w:before="240" w:lineRule="auto"/>
         <w:rPr/>
       </w:pPr>
@@ -6959,6 +7039,182 @@
           <w:rtl w:val="0"/>
         </w:rPr>
         <w:t xml:space="preserve">The system shall provide a logout function that terminates the administrator's active session.</w:t>
+      </w:r>
+    </w:p>
+    <w:p>
+      <w:pPr>
+        <w:pStyle w:val="Heading3"/>
+      </w:pPr>
+      <w:r>
+        <w:t>Receptionist Account Provisioning</w:t>
+      </w:r>
+    </w:p>
+    <w:p>
+      <w:pPr>
+        <w:pStyle w:val="Normal"/>
+      </w:pPr>
+      <w:r>
+        <w:t>The system shall allow administrators to create and manage receptionist user accounts, including specifying the receptionist's name, email address, password, and assigned desk location.</w:t>
+      </w:r>
+    </w:p>
+    <w:p>
+      <w:pPr>
+        <w:pStyle w:val="Heading3"/>
+      </w:pPr>
+      <w:r>
+        <w:t>Interface Theme Selection</w:t>
+      </w:r>
+    </w:p>
+    <w:p>
+      <w:pPr>
+        <w:pStyle w:val="Normal"/>
+      </w:pPr>
+      <w:r>
+        <w:t>The system shall support both a light and a dark interface theme. The selected theme shall be persisted across sessions.</w:t>
+      </w:r>
+    </w:p>
+    <w:p>
+      <w:pPr>
+        <w:pStyle w:val="Heading3"/>
+      </w:pPr>
+      <w:r>
+        <w:t>Command Palette</w:t>
+      </w:r>
+    </w:p>
+    <w:p>
+      <w:pPr>
+        <w:pStyle w:val="Normal"/>
+      </w:pPr>
+      <w:r>
+        <w:t>The system shall provide a keyboard-activated command palette (accessible via Ctrl+K or Cmd+K) that allows users to search for visitors, navigate between views, perform quick actions such as check-out, toggle the interface theme, and export data without using the standard navigation menus.</w:t>
+      </w:r>
+    </w:p>
+    <w:p>
+      <w:pPr>
+        <w:pStyle w:val="Heading3"/>
+      </w:pPr>
+      <w:r>
+        <w:t>Audit Log</w:t>
+      </w:r>
+    </w:p>
+    <w:p>
+      <w:pPr>
+        <w:pStyle w:val="Normal"/>
+      </w:pPr>
+      <w:r>
+        <w:t>The system shall record an audit log entry for each administrative action performed within the system. Each log entry shall capture the timestamp, the user who performed the action, the action type, the affected resource type and identifier, and any relevant details.</w:t>
+      </w:r>
+    </w:p>
+    <w:p>
+      <w:pPr>
+        <w:pStyle w:val="Heading3"/>
+      </w:pPr>
+      <w:r>
+        <w:t>Advanced Analytics and Reporting</w:t>
+      </w:r>
+    </w:p>
+    <w:p>
+      <w:pPr>
+        <w:pStyle w:val="Normal"/>
+      </w:pPr>
+      <w:r>
+        <w:t>The system shall provide an analytics dashboard with time-range filtering (today, last seven days, last thirty days, all time). The dashboard shall display metrics including total visitors, active visitors, completed visits, overdue visitors, average visit duration, identification compliance rate, top departments by traffic, visit purpose distribution, and peak visiting hours.</w:t>
+      </w:r>
+    </w:p>
+    <w:p>
+      <w:pPr>
+        <w:pStyle w:val="Heading3"/>
+      </w:pPr>
+      <w:r>
+        <w:t>Departments and Host Staff Directory</w:t>
+      </w:r>
+    </w:p>
+    <w:p>
+      <w:pPr>
+        <w:pStyle w:val="Normal"/>
+      </w:pPr>
+      <w:r>
+        <w:t>The system shall maintain a directory of organizational departments and associated host staff members. Each department record shall include the department name, code, floor, and head. Each host record shall include the staff member's name, title, department, and email address. The directory shall be searchable.</w:t>
+      </w:r>
+    </w:p>
+    <w:p>
+      <w:pPr>
+        <w:pStyle w:val="Heading3"/>
+      </w:pPr>
+      <w:r>
+        <w:t>Live Real-Time Presence Tracking</w:t>
+      </w:r>
+    </w:p>
+    <w:p>
+      <w:pPr>
+        <w:pStyle w:val="Normal"/>
+      </w:pPr>
+      <w:r>
+        <w:t>The system shall provide a live presence board that displays all currently checked-in visitors. The board shall refresh in real time, showing the elapsed duration of each visit and highlighting visitors whose expected visit duration has been exceeded (Overdue status).</w:t>
+      </w:r>
+    </w:p>
+    <w:p>
+      <w:pPr>
+        <w:pStyle w:val="Heading3"/>
+      </w:pPr>
+      <w:r>
+        <w:t>Dynamic Visitor Form Builder</w:t>
+      </w:r>
+    </w:p>
+    <w:p>
+      <w:pPr>
+        <w:pStyle w:val="Normal"/>
+      </w:pPr>
+      <w:r>
+        <w:t>The system shall allow administrators to define custom visitor registration fields. Supported field types shall include single-line text, numeric input, email, dropdown selector, checkbox, multi-line notes, date/time, photo capture, and host-directory picker. Each field shall be configurable as required or optional and may be set to appear in the visitor table or on the printed badge.</w:t>
+      </w:r>
+    </w:p>
+    <w:p>
+      <w:pPr>
+        <w:pStyle w:val="Heading3"/>
+      </w:pPr>
+      <w:r>
+        <w:t>Visitor Pass and QR-Code Badge Generation</w:t>
+      </w:r>
+    </w:p>
+    <w:p>
+      <w:pPr>
+        <w:pStyle w:val="Normal"/>
+      </w:pPr>
+      <w:r>
+        <w:t>The system shall generate a printable visitor pass for each registered guest. The pass shall include a QR code encoding the visitor's identification details, badge number, host, and check-in time to support identity verification.</w:t>
+      </w:r>
+    </w:p>
+    <w:p>
+      <w:pPr>
+        <w:pStyle w:val="Heading3"/>
+      </w:pPr>
+      <w:r>
+        <w:t>Role-Based Access Control</w:t>
+      </w:r>
+    </w:p>
+    <w:p>
+      <w:pPr>
+        <w:pStyle w:val="Normal"/>
+      </w:pPr>
+      <w:r>
+        <w:t>The system shall provide at least two user roles: Administrator and Receptionist. Administrators shall have full access to all functions. Receptionists shall be able to register and check out guests but shall not access administrative configuration or reporting features.</w:t>
+      </w:r>
+    </w:p>
+    <w:p>
+      <w:pPr>
+        <w:pStyle w:val="Heading3"/>
+      </w:pPr>
+      <w:r>
+        <w:t>Multi-Organization Management</w:t>
+      </w:r>
+    </w:p>
+    <w:p>
+      <w:pPr>
+        <w:pStyle w:val="Normal"/>
+      </w:pPr>
+      <w:r>
+        <w:t>The system shall support the creation and management of multiple independent organizations, each with its own administrator account, visitor records, and configuration settings.</w:t>
       </w:r>
     </w:p>
     <w:p>
@@ -7862,7 +8118,7 @@
         <w:rPr>
           <w:rtl w:val="0"/>
         </w:rPr>
-        <w:t xml:space="preserve">The proposed system can be developed using the following software technologies:</w:t>
+        <w:t>The system was implemented using the following software technologies:</w:t>
       </w:r>
     </w:p>
     <w:tbl>
@@ -8492,7 +8748,7 @@
         <w:rPr>
           <w:rtl w:val="0"/>
         </w:rPr>
-        <w:t xml:space="preserve">The final technology selection may be adjusted during implementation depending on the development environment available.</w:t>
+        <w:t>The front-end is built with React 18 and Vite, with styling provided by Tailwind CSS. The back-end uses Node.js with an Express server. Data persistence is managed through Supabase (a hosted PostgreSQL service) as the primary database, with a local SQLite database used as a fallback for offline or development use. Additional libraries include qrcode.react for QR-code generation, canvas-confetti for onboarding animations, and lucide-react for iconography. The application is containerised using Docker and is deployable to cloud hosting platforms such as Vercel.</w:t>
       </w:r>
     </w:p>
     <w:p>
@@ -8713,6 +8969,62 @@
     </w:p>
     <w:p>
       <w:pPr>
+        <w:pStyle w:val="Normal"/>
+      </w:pPr>
+      <w:r>
+        <w:t>Live presence tracking board</w:t>
+      </w:r>
+    </w:p>
+    <w:p>
+      <w:pPr>
+        <w:pStyle w:val="Normal"/>
+      </w:pPr>
+      <w:r>
+        <w:t>Analytics and reporting dashboard</w:t>
+      </w:r>
+    </w:p>
+    <w:p>
+      <w:pPr>
+        <w:pStyle w:val="Normal"/>
+      </w:pPr>
+      <w:r>
+        <w:t>Departments and host directory</w:t>
+      </w:r>
+    </w:p>
+    <w:p>
+      <w:pPr>
+        <w:pStyle w:val="Normal"/>
+      </w:pPr>
+      <w:r>
+        <w:t>Visitor pass and badge print view</w:t>
+      </w:r>
+    </w:p>
+    <w:p>
+      <w:pPr>
+        <w:pStyle w:val="Normal"/>
+      </w:pPr>
+      <w:r>
+        <w:t>System settings and form-builder panel</w:t>
+      </w:r>
+    </w:p>
+    <w:p>
+      <w:pPr>
+        <w:pStyle w:val="Normal"/>
+      </w:pPr>
+      <w:r>
+        <w:t>Organization setup wizard</w:t>
+      </w:r>
+    </w:p>
+    <w:p>
+      <w:pPr>
+        <w:pStyle w:val="Normal"/>
+      </w:pPr>
+      <w:r>
+        <w:t>Command palette overlay</w:t>
+      </w:r>
+    </w:p>
+    <w:p>
+      <w:pPr>
         <w:pStyle w:val="Heading3"/>
         <w:keepNext w:val="0"/>
         <w:keepLines w:val="0"/>
@@ -8861,6 +9173,62 @@
     </w:p>
     <w:p>
       <w:pPr>
+        <w:pStyle w:val="Normal"/>
+      </w:pPr>
+      <w:r>
+        <w:t>Managing multi-organization tenancy</w:t>
+      </w:r>
+    </w:p>
+    <w:p>
+      <w:pPr>
+        <w:pStyle w:val="Normal"/>
+      </w:pPr>
+      <w:r>
+        <w:t>Enforcing role-based access permissions</w:t>
+      </w:r>
+    </w:p>
+    <w:p>
+      <w:pPr>
+        <w:pStyle w:val="Normal"/>
+      </w:pPr>
+      <w:r>
+        <w:t>Generating and rendering visitor pass badges with QR codes</w:t>
+      </w:r>
+    </w:p>
+    <w:p>
+      <w:pPr>
+        <w:pStyle w:val="Normal"/>
+      </w:pPr>
+      <w:r>
+        <w:t>Evaluating visitor overdue status based on expected duration</w:t>
+      </w:r>
+    </w:p>
+    <w:p>
+      <w:pPr>
+        <w:pStyle w:val="Normal"/>
+      </w:pPr>
+      <w:r>
+        <w:t>Computing analytics aggregates (average duration, traffic trends, peak hours)</w:t>
+      </w:r>
+    </w:p>
+    <w:p>
+      <w:pPr>
+        <w:pStyle w:val="Normal"/>
+      </w:pPr>
+      <w:r>
+        <w:t>Writing and retrieving audit log entries</w:t>
+      </w:r>
+    </w:p>
+    <w:p>
+      <w:pPr>
+        <w:pStyle w:val="Normal"/>
+      </w:pPr>
+      <w:r>
+        <w:t>Persisting and applying dynamic form field configurations</w:t>
+      </w:r>
+    </w:p>
+    <w:p>
+      <w:pPr>
         <w:pStyle w:val="Heading3"/>
         <w:keepNext w:val="0"/>
         <w:keepLines w:val="0"/>
@@ -8973,6 +9341,38 @@
           <w:rtl w:val="0"/>
         </w:rPr>
         <w:t xml:space="preserve">Check-in/check-out activities</w:t>
+      </w:r>
+    </w:p>
+    <w:p>
+      <w:pPr>
+        <w:pStyle w:val="Normal"/>
+      </w:pPr>
+      <w:r>
+        <w:t>Organizations and their configuration settings</w:t>
+      </w:r>
+    </w:p>
+    <w:p>
+      <w:pPr>
+        <w:pStyle w:val="Normal"/>
+      </w:pPr>
+      <w:r>
+        <w:t>Dynamic visitor field schema definitions</w:t>
+      </w:r>
+    </w:p>
+    <w:p>
+      <w:pPr>
+        <w:pStyle w:val="Normal"/>
+      </w:pPr>
+      <w:r>
+        <w:t>Departments and host staff directory entries</w:t>
+      </w:r>
+    </w:p>
+    <w:p>
+      <w:pPr>
+        <w:pStyle w:val="Normal"/>
+      </w:pPr>
+      <w:r>
+        <w:t>Audit log records</w:t>
       </w:r>
     </w:p>
     <w:p>
@@ -9647,6 +10047,132 @@
           <w:rtl w:val="0"/>
         </w:rPr>
         <w:t xml:space="preserve">The reporting function will allow administrators to view relevant visitor information for administrative purposes.</w:t>
+      </w:r>
+    </w:p>
+    <w:p>
+      <w:pPr>
+        <w:pStyle w:val="Heading2"/>
+      </w:pPr>
+      <w:r>
+        <w:t>3.11.9 Multi-Organization and Setup Module</w:t>
+      </w:r>
+    </w:p>
+    <w:p>
+      <w:pPr/>
+      <w:r>
+        <w:t>This module manages the creation of organizations and administrator accounts. It provides a multi-step setup wizard that collects organization details, configures the visitor registration form, and creates the initial administrator account. It also supports switching between multiple organizations within the same session.</w:t>
+      </w:r>
+    </w:p>
+    <w:p>
+      <w:pPr>
+        <w:pStyle w:val="Heading2"/>
+      </w:pPr>
+      <w:r>
+        <w:t>3.11.10 Role and User Management Module</w:t>
+      </w:r>
+    </w:p>
+    <w:p>
+      <w:pPr/>
+      <w:r>
+        <w:t>This module manages user accounts and roles within an organization. Administrators can create receptionist accounts, assign desk locations, and control the level of access granted to each user. Role enforcement is applied throughout the application to restrict administrative functions to users with appropriate permissions.</w:t>
+      </w:r>
+    </w:p>
+    <w:p>
+      <w:pPr>
+        <w:pStyle w:val="Heading2"/>
+      </w:pPr>
+      <w:r>
+        <w:t>3.11.11 Visitor Pass and Badge Module</w:t>
+      </w:r>
+    </w:p>
+    <w:p>
+      <w:pPr/>
+      <w:r>
+        <w:t>This module generates a printable visitor pass for each checked-in guest. The pass displays key visit details together with a QR code that encodes the visitor's identity, badge identifier, host name, and check-in time. The pass can be printed from within the browser.</w:t>
+      </w:r>
+    </w:p>
+    <w:p>
+      <w:pPr>
+        <w:pStyle w:val="Heading2"/>
+      </w:pPr>
+      <w:r>
+        <w:t>3.11.12 Dynamic Form Builder Module</w:t>
+      </w:r>
+    </w:p>
+    <w:p>
+      <w:pPr/>
+      <w:r>
+        <w:t>This module allows administrators to define the fields that appear on the visitor registration form. Administrators can add, remove, and reorder fields, select a field type from nine available options, and configure whether each field is required, visible in the visitor table, or printed on the visitor badge.</w:t>
+      </w:r>
+    </w:p>
+    <w:p>
+      <w:pPr>
+        <w:pStyle w:val="Heading2"/>
+      </w:pPr>
+      <w:r>
+        <w:t>3.11.13 Live Presence Tracking Module</w:t>
+      </w:r>
+    </w:p>
+    <w:p>
+      <w:pPr/>
+      <w:r>
+        <w:t>This module displays a real-time board of all visitors currently on the premises. Elapsed visit duration is updated every second. Visitors whose expected duration has elapsed are automatically flagged as Overdue. Quick-action controls allow an administrator to check out a visitor, view the visitor pass, or open the full visitor detail record directly from the board.</w:t>
+      </w:r>
+    </w:p>
+    <w:p>
+      <w:pPr>
+        <w:pStyle w:val="Heading2"/>
+      </w:pPr>
+      <w:r>
+        <w:t>3.11.14 Departments and Hosts Directory Module</w:t>
+      </w:r>
+    </w:p>
+    <w:p>
+      <w:pPr/>
+      <w:r>
+        <w:t>This module maintains and displays an organizational directory of departments and their associated host staff members. Each department card displays the department head, floor location, and the number of visitors currently present in that department. The directory is fully searchable.</w:t>
+      </w:r>
+    </w:p>
+    <w:p>
+      <w:pPr>
+        <w:pStyle w:val="Heading2"/>
+      </w:pPr>
+      <w:r>
+        <w:t>3.11.15 Analytics Module</w:t>
+      </w:r>
+    </w:p>
+    <w:p>
+      <w:pPr/>
+      <w:r>
+        <w:t>This module provides an analytics dashboard with time-range filtering. It presents summary statistics and detailed breakdowns including average visit duration, identification compliance rate, visits by department, visit purpose distribution, and peak hour traffic analysis. Visitor records can be exported to CSV format from this module.</w:t>
+      </w:r>
+    </w:p>
+    <w:p>
+      <w:pPr>
+        <w:pStyle w:val="Heading2"/>
+      </w:pPr>
+      <w:r>
+        <w:t>3.11.16 Audit Log Module</w:t>
+      </w:r>
+    </w:p>
+    <w:p>
+      <w:pPr/>
+      <w:r>
+        <w:t>This module records and displays a log of administrative actions performed within the system. Log entries include the action type, the responsible user, the affected resource, and a timestamp, providing a traceable record of system activity.</w:t>
+      </w:r>
+    </w:p>
+    <w:p>
+      <w:pPr>
+        <w:pStyle w:val="Heading2"/>
+      </w:pPr>
+      <w:r>
+        <w:t>3.11.17 Command Palette Module</w:t>
+      </w:r>
+    </w:p>
+    <w:p>
+      <w:pPr/>
+      <w:r>
+        <w:t>This module provides a keyboard-activated overlay (Ctrl+K / Cmd+K) that allows users to search visitor records, navigate to any section of the application, perform quick actions such as check-out or badge generation, toggle the interface theme, and export data using only the keyboard.</w:t>
       </w:r>
     </w:p>
     <w:p>
@@ -14162,6 +14688,38 @@
     </w:p>
     <w:p>
       <w:pPr>
+        <w:pStyle w:val="Heading3"/>
+      </w:pPr>
+      <w:r>
+        <w:t>Audit Logging</w:t>
+      </w:r>
+    </w:p>
+    <w:p>
+      <w:pPr>
+        <w:pStyle w:val="Normal"/>
+      </w:pPr>
+      <w:r>
+        <w:t>All administrative actions are recorded in the audit log table. This provides accountability and supports detection of unauthorized or erroneous operations.</w:t>
+      </w:r>
+    </w:p>
+    <w:p>
+      <w:pPr>
+        <w:pStyle w:val="Heading3"/>
+      </w:pPr>
+      <w:r>
+        <w:t>Row-Level Security</w:t>
+      </w:r>
+    </w:p>
+    <w:p>
+      <w:pPr>
+        <w:pStyle w:val="Normal"/>
+      </w:pPr>
+      <w:r>
+        <w:t>The Supabase PostgreSQL database employs Row-Level Security (RLS) policies to ensure that each organization can only access its own data. All queries are scoped by organization identifier at the database layer.</w:t>
+      </w:r>
+    </w:p>
+    <w:p>
+      <w:pPr>
         <w:spacing w:after="240" w:before="240" w:lineRule="auto"/>
         <w:rPr/>
       </w:pPr>
@@ -15262,7 +15820,7 @@
         <w:rPr>
           <w:rtl w:val="0"/>
         </w:rPr>
-        <w:t xml:space="preserve">The prototype was designed around standard web technologies. The major technologies used include HTML, CSS, JavaScript, and browser-based data storage.</w:t>
+        <w:t>The system was implemented using React 18 with Vite as the build tool, Tailwind CSS for component styling, Node.js with Express for the back-end server, and Supabase (PostgreSQL) as the primary cloud database. A local SQLite database is also integrated as a fallback data store. Additional packages include qrcode.react (QR-code generation), canvas-confetti (onboarding experience), and lucide-react (icon library). The application is packaged using Docker and can be deployed to cloud platforms.</w:t>
       </w:r>
     </w:p>
     <w:tbl>
@@ -15764,7 +16322,7 @@
         <w:rPr>
           <w:rtl w:val="0"/>
         </w:rPr>
-        <w:t xml:space="preserve">The use of standard web technologies makes the prototype relatively easy to demonstrate and provides a foundation for future connection to a server-side database.</w:t>
+        <w:t>The use of established open-source web technologies ensures that the system is easy to maintain, extend, and deploy. The component-based React architecture facilitates the addition of new features without disrupting existing functionality.</w:t>
       </w:r>
     </w:p>
     <w:p>
@@ -15979,14 +16537,94 @@
     </w:p>
     <w:p>
       <w:pPr>
-        <w:spacing w:after="240" w:before="240" w:lineRule="auto"/>
-        <w:rPr/>
-      </w:pPr>
-      <w:r>
-        <w:rPr>
-          <w:rtl w:val="0"/>
-        </w:rPr>
-        <w:t xml:space="preserve">The system interface was designed to provide a simple navigation structure. Users can move between the Dashboard, Register Guest, Guest Records, and Reports sections.</w:t>
+        <w:pStyle w:val="Normal"/>
+      </w:pPr>
+      <w:r>
+        <w:t>Multi-organization setup and management</w:t>
+      </w:r>
+    </w:p>
+    <w:p>
+      <w:pPr>
+        <w:pStyle w:val="Normal"/>
+      </w:pPr>
+      <w:r>
+        <w:t>Role-based access control</w:t>
+      </w:r>
+    </w:p>
+    <w:p>
+      <w:pPr>
+        <w:pStyle w:val="Normal"/>
+      </w:pPr>
+      <w:r>
+        <w:t>Visitor pass and QR-code badge generation</w:t>
+      </w:r>
+    </w:p>
+    <w:p>
+      <w:pPr>
+        <w:pStyle w:val="Normal"/>
+      </w:pPr>
+      <w:r>
+        <w:t>Dynamic visitor registration form builder</w:t>
+      </w:r>
+    </w:p>
+    <w:p>
+      <w:pPr>
+        <w:pStyle w:val="Normal"/>
+      </w:pPr>
+      <w:r>
+        <w:t>Live real-time presence tracking board</w:t>
+      </w:r>
+    </w:p>
+    <w:p>
+      <w:pPr>
+        <w:pStyle w:val="Normal"/>
+      </w:pPr>
+      <w:r>
+        <w:t>Departments and host staff directory</w:t>
+      </w:r>
+    </w:p>
+    <w:p>
+      <w:pPr>
+        <w:pStyle w:val="Normal"/>
+      </w:pPr>
+      <w:r>
+        <w:t>Advanced analytics with time-range filtering</w:t>
+      </w:r>
+    </w:p>
+    <w:p>
+      <w:pPr>
+        <w:pStyle w:val="Normal"/>
+      </w:pPr>
+      <w:r>
+        <w:t>Audit log and system activity tracking</w:t>
+      </w:r>
+    </w:p>
+    <w:p>
+      <w:pPr>
+        <w:pStyle w:val="Normal"/>
+      </w:pPr>
+      <w:r>
+        <w:t>Keyboard command palette</w:t>
+      </w:r>
+    </w:p>
+    <w:p>
+      <w:pPr>
+        <w:pStyle w:val="Normal"/>
+      </w:pPr>
+      <w:r>
+        <w:t>Dark and light mode theming</w:t>
+      </w:r>
+    </w:p>
+    <w:p>
+      <w:pPr>
+        <w:spacing w:after="240" w:before="240" w:lineRule="auto"/>
+        <w:rPr/>
+      </w:pPr>
+      <w:r>
+        <w:rPr>
+          <w:rtl w:val="0"/>
+        </w:rPr>
+        <w:t>The system interface provides a sidebar navigation structure with dedicated views for Live Tracking, Visitor Log, Analytics, Departments, and Settings. A persistent header provides a global search bar and access to the command palette, theme toggle, and user profile menu.</w:t>
       </w:r>
     </w:p>
     <w:p>
@@ -16190,7 +16828,7 @@
         </w:rPr>
         <w:drawing>
           <wp:inline distB="114300" distT="114300" distL="114300" distR="114300">
-            <wp:extent cx="5731200" cy="3441700"/>
+            <wp:extent cx="5731200" cy="2817700"/>
             <wp:effectExtent b="0" l="0" r="0" t="0"/>
             <wp:docPr id="7" name="image1.png"/>
             <a:graphic>
@@ -16210,7 +16848,7 @@
                   <pic:spPr>
                     <a:xfrm>
                       <a:off x="0" y="0"/>
-                      <a:ext cx="5731200" cy="3441700"/>
+                      <a:ext cx="5731200" cy="2817700"/>
                     </a:xfrm>
                     <a:prstGeom prst="rect"/>
                     <a:ln/>
@@ -16434,14 +17072,54 @@
     </w:p>
     <w:p>
       <w:pPr>
-        <w:spacing w:after="240" w:before="240" w:lineRule="auto"/>
-        <w:rPr/>
-      </w:pPr>
-      <w:r>
-        <w:rPr>
-          <w:rtl w:val="0"/>
-        </w:rPr>
-        <w:t xml:space="preserve">Required information is entered through structured input fields. The registration process is designed to reduce the problems associated with handwritten visitor registers.</w:t>
+        <w:pStyle w:val="Normal"/>
+      </w:pPr>
+      <w:r>
+        <w:t>Company or organization</w:t>
+      </w:r>
+    </w:p>
+    <w:p>
+      <w:pPr>
+        <w:pStyle w:val="Normal"/>
+      </w:pPr>
+      <w:r>
+        <w:t>Vehicle registration plate</w:t>
+      </w:r>
+    </w:p>
+    <w:p>
+      <w:pPr>
+        <w:pStyle w:val="Normal"/>
+      </w:pPr>
+      <w:r>
+        <w:t>Expected visit duration</w:t>
+      </w:r>
+    </w:p>
+    <w:p>
+      <w:pPr>
+        <w:pStyle w:val="Normal"/>
+      </w:pPr>
+      <w:r>
+        <w:t>Notes or special instructions</w:t>
+      </w:r>
+    </w:p>
+    <w:p>
+      <w:pPr>
+        <w:pStyle w:val="Normal"/>
+      </w:pPr>
+      <w:r>
+        <w:t>Additional custom fields defined by the administrator</w:t>
+      </w:r>
+    </w:p>
+    <w:p>
+      <w:pPr>
+        <w:spacing w:after="240" w:before="240" w:lineRule="auto"/>
+        <w:rPr/>
+      </w:pPr>
+      <w:r>
+        <w:rPr>
+          <w:rtl w:val="0"/>
+        </w:rPr>
+        <w:t>Required information is entered through structured input fields. The registration form is configurable: administrators can add, remove, and reorder fields using the Dynamic Form Builder. This allows organizations to tailor the registration process to their specific requirements without modifying the underlying application code. The registration process is designed to reduce the problems associated with handwritten visitor registers by enforcing structured and validated data entry.</w:t>
       </w:r>
     </w:p>
     <w:p>
@@ -16499,7 +17177,7 @@
         </w:rPr>
         <w:drawing>
           <wp:inline distB="114300" distT="114300" distL="114300" distR="114300">
-            <wp:extent cx="5731200" cy="3441700"/>
+            <wp:extent cx="3657600" cy="3903500"/>
             <wp:effectExtent b="0" l="0" r="0" t="0"/>
             <wp:docPr id="2" name="image6.png"/>
             <a:graphic>
@@ -16519,7 +17197,7 @@
                   <pic:spPr>
                     <a:xfrm>
                       <a:off x="0" y="0"/>
-                      <a:ext cx="5731200" cy="3441700"/>
+                      <a:ext cx="3657600" cy="3903500"/>
                     </a:xfrm>
                     <a:prstGeom prst="rect"/>
                     <a:ln/>
@@ -17042,7 +17720,7 @@
         </w:rPr>
         <w:drawing>
           <wp:inline distB="114300" distT="114300" distL="114300" distR="114300">
-            <wp:extent cx="5731200" cy="3441700"/>
+            <wp:extent cx="5731200" cy="2802500"/>
             <wp:effectExtent b="0" l="0" r="0" t="0"/>
             <wp:docPr id="6" name="image5.png"/>
             <a:graphic>
@@ -17062,7 +17740,7 @@
                   <pic:spPr>
                     <a:xfrm>
                       <a:off x="0" y="0"/>
-                      <a:ext cx="5731200" cy="3441700"/>
+                      <a:ext cx="5731200" cy="2802500"/>
                     </a:xfrm>
                     <a:prstGeom prst="rect"/>
                     <a:ln/>
@@ -17671,7 +18349,7 @@
         </w:rPr>
         <w:drawing>
           <wp:inline distB="114300" distT="114300" distL="114300" distR="114300">
-            <wp:extent cx="5731200" cy="3441700"/>
+            <wp:extent cx="5731200" cy="2802500"/>
             <wp:effectExtent b="0" l="0" r="0" t="0"/>
             <wp:docPr id="5" name="image2.png"/>
             <a:graphic>
@@ -17691,7 +18369,7 @@
                   <pic:spPr>
                     <a:xfrm>
                       <a:off x="0" y="0"/>
-                      <a:ext cx="5731200" cy="3441700"/>
+                      <a:ext cx="5731200" cy="2802500"/>
                     </a:xfrm>
                     <a:prstGeom prst="rect"/>
                     <a:ln/>
@@ -18934,6 +19612,276 @@
     <w:p>
       <w:pPr>
         <w:pStyle w:val="Heading1"/>
+      </w:pPr>
+      <w:r>
+        <w:t>4.14 Implementation of the Multi-Organization Module</w:t>
+      </w:r>
+    </w:p>
+    <w:p>
+      <w:pPr/>
+      <w:r>
+        <w:t>The multi-organization module provides the system with the ability to serve multiple independent organizations from a single deployment. When first accessed, the system presents a setup wizard that guides the administrator through configuring the organization name, industry, contact email, and initial administrator credentials. Each organization is assigned a unique slug identifier, and all system records including visitors, departments, hosts, users, and audit logs are scoped to the organization by an organization identifier field. The header provides an organization switcher that allows an administrator to move between organizations if multiple have been configured.</w:t>
+      </w:r>
+    </w:p>
+    <w:p>
+      <w:pPr>
+        <w:pStyle w:val="Heading1"/>
+      </w:pPr>
+      <w:r>
+        <w:t>4.15 Implementation of the Role-Based Access Control Module</w:t>
+      </w:r>
+    </w:p>
+    <w:p>
+      <w:pPr/>
+      <w:r>
+        <w:t>The role-based access control module restricts system functions based on the authenticated user's assigned role. Two roles are supported: Administrator and Receptionist. Administrators have full access to all modules including settings, analytics, audit logs, and user management. Receptionist accounts are created and managed by administrators through the Settings view. Receptionists can register guests and record check-outs but cannot access administrative configuration or reporting features. Role enforcement is applied at the component level throughout the React application.</w:t>
+      </w:r>
+    </w:p>
+    <w:p>
+      <w:pPr>
+        <w:pStyle w:val="Heading1"/>
+      </w:pPr>
+      <w:r>
+        <w:t>4.16 Implementation of the Visitor Pass and QR-Code Badge Module</w:t>
+      </w:r>
+    </w:p>
+    <w:p>
+      <w:pPr/>
+      <w:r>
+        <w:t>The visitor pass module generates a printable badge for each registered visitor. The badge displays the organization name, visitor name, host, department, check-in time, badge identifier, and expected departure time. A QR code is embedded in the badge using the qrcode.react library. The QR code encodes a JSON payload containing the organization slug, badge identifier, visitor identifier, full name, telephone number, host name, and check-in time. This allows the badge to be scanned by a QR-code reader for rapid identity verification. The badge can be printed directly from the browser using the browser's native print function.</w:t>
+      </w:r>
+    </w:p>
+    <w:p>
+      <w:pPr>
+        <w:pStyle w:val="Heading3"/>
+      </w:pPr>
+      <w:r>
+        <w:rPr>
+          <w:b/>
+        </w:rPr>
+        <w:t>Figure 4.5: Implemented Visitor Pass and QR-Code Badge Interface</w:t>
+      </w:r>
+    </w:p>
+    <w:p>
+      <w:pPr>
+        <w:jc w:val="center"/>
+      </w:pPr>
+      <w:r>
+        <w:drawing>
+          <wp:inline>
+            <wp:extent cx="2377440" cy="4109263"/>
+            <wp:docPr id="8" name="Picture 8"/>
+            <wp:cNvGraphicFramePr>
+              <a:graphicFrameLocks noChangeAspect="1"/>
+            </wp:cNvGraphicFramePr>
+            <a:graphic>
+              <a:graphicData uri="http://schemas.openxmlformats.org/drawingml/2006/picture">
+                <pic:pic>
+                  <pic:nvPicPr>
+                    <pic:cNvPr id="0" name="visitor pass badge.png"/>
+                    <pic:cNvPicPr/>
+                  </pic:nvPicPr>
+                  <pic:blipFill>
+                    <a:blip r:embed="rId13"/>
+                    <a:stretch>
+                      <a:fillRect/>
+                    </a:stretch>
+                  </pic:blipFill>
+                  <pic:spPr>
+                    <a:xfrm>
+                      <a:off x="0" y="0"/>
+                      <a:ext cx="2377440" cy="4109263"/>
+                    </a:xfrm>
+                    <a:prstGeom prst="rect"/>
+                  </pic:spPr>
+                </pic:pic>
+              </a:graphicData>
+            </a:graphic>
+          </wp:inline>
+        </w:drawing>
+      </w:r>
+    </w:p>
+    <w:p>
+      <w:pPr/>
+      <w:r>
+        <w:rPr>
+          <w:i/>
+        </w:rPr>
+        <w:t>Source: Author's Implementation (2026).</w:t>
+      </w:r>
+    </w:p>
+    <w:p>
+      <w:pPr/>
+      <w:r>
+        <w:t>Figure 4.5 illustrates the generated visitor pass badge displaying guest identification details, visit schedule, host information, and the verification QR code.</w:t>
+      </w:r>
+    </w:p>
+    <w:p>
+      <w:pPr>
+        <w:pStyle w:val="Heading1"/>
+      </w:pPr>
+      <w:r>
+        <w:t>4.17 Implementation of the Dynamic Form Builder Module</w:t>
+      </w:r>
+    </w:p>
+    <w:p>
+      <w:pPr/>
+      <w:r>
+        <w:t>The dynamic form builder allows administrators to configure the visitor registration form without modifying application code. The builder is accessible from the Settings view under the Form Builder tab and also during the initial organization setup wizard. Administrators can add new fields by specifying a field name, selecting a field type from nine available options, defining whether the field is required, and configuring whether the field should appear in the visitor records table or on the printed visitor badge. For dropdown fields, the administrator can define the available options. Fields can be removed individually, and the resulting schema is stored in the organization fields table in the database and applied to all subsequent visitor registrations.</w:t>
+      </w:r>
+    </w:p>
+    <w:p>
+      <w:pPr>
+        <w:pStyle w:val="Heading1"/>
+      </w:pPr>
+      <w:r>
+        <w:t>4.18 Implementation of the Live Real-Time Presence Tracking Module</w:t>
+      </w:r>
+    </w:p>
+    <w:p>
+      <w:pPr/>
+      <w:r>
+        <w:t>The live presence tracking module displays all visitors who are currently on the premises in a card-based layout. A JavaScript interval updates the elapsed visit duration every second, providing a continuously refreshing view of how long each visitor has been present. If a visitor's elapsed duration exceeds the expected duration specified at check-in, the visitor's status is automatically updated to Overdue and the card is visually highlighted. Each card provides quick-action controls that allow an administrator to check out the visitor, open the visitor pass, or view the full visitor detail record without navigating away from the board. The board also supports filtering by department and searching by name, company, host, or badge identifier.</w:t>
+      </w:r>
+    </w:p>
+    <w:p>
+      <w:pPr>
+        <w:pStyle w:val="Heading1"/>
+      </w:pPr>
+      <w:r>
+        <w:t>4.19 Implementation of the Departments and Host Directory Module</w:t>
+      </w:r>
+    </w:p>
+    <w:p>
+      <w:pPr/>
+      <w:r>
+        <w:t>The departments module maintains an organizational directory of departments and their associated host staff. Each department card displays the department name, code, floor, department head, a list of associated hosts with their titles and email addresses, and the number of visitors currently present in that department. Clicking a department card applies a filter to the live tracker view showing only visitors associated with that department. The directory supports full-text search across department names, codes, floors, and host details. Administrators can also initiate a new visitor check-in directly from the departments view, with the department pre-populated in the registration form.</w:t>
+      </w:r>
+    </w:p>
+    <w:p>
+      <w:pPr>
+        <w:pStyle w:val="Heading1"/>
+      </w:pPr>
+      <w:r>
+        <w:t>4.20 Implementation of the Advanced Analytics Module</w:t>
+      </w:r>
+    </w:p>
+    <w:p>
+      <w:pPr/>
+      <w:r>
+        <w:t>The analytics module provides a comprehensive reporting dashboard with four time-range filter options: today, last seven days, last thirty days, and all time. The dashboard displays summary statistics including total visitor count, currently active visitors, completed visits, and overdue visitors. Additional computed metrics include the average visit duration for checked-out visitors, and the identification compliance rate, which measures the proportion of visitors who provided an identification number at registration. Breakdown panels present visits by department, visit purpose distribution, and peak hour traffic analysis showing which hours of the day receive the most visitors. All visitor records matching the selected time range can be exported to a CSV file for use in external reporting tools.</w:t>
+      </w:r>
+    </w:p>
+    <w:p>
+      <w:pPr>
+        <w:pStyle w:val="Heading1"/>
+      </w:pPr>
+      <w:r>
+        <w:t>4.21 Implementation of the Audit Log Module</w:t>
+      </w:r>
+    </w:p>
+    <w:p>
+      <w:pPr/>
+      <w:r>
+        <w:t>The audit log module records a structured entry in the audit_logs database table each time an administrator performs a significant action within the system. Logged actions include visitor registration, check-out, record updates, user provisioning, and configuration changes. Each log entry captures the timestamp, the identifier and name of the user who performed the action, the action type, the affected resource type, the affected resource identifier, and a textual description of the change. The audit log is displayed in the Settings view under the Database tab, allowing administrators to review recent system activity.</w:t>
+      </w:r>
+    </w:p>
+    <w:p>
+      <w:pPr>
+        <w:pStyle w:val="Heading1"/>
+      </w:pPr>
+      <w:r>
+        <w:t>4.22 Implementation of the Command Palette Module</w:t>
+      </w:r>
+    </w:p>
+    <w:p>
+      <w:pPr/>
+      <w:r>
+        <w:t>The command palette provides a keyboard-driven interface for performing common actions rapidly. It is activated by pressing Ctrl+K on Windows and Linux or Cmd+K on macOS. The palette presents a searchable list of navigation actions, visitor records, and utility commands. Typing in the palette's search field filters the available options in real time. Keyboard arrow keys move the selection, and the Enter key executes the selected action. Available actions include navigating to any view, registering a new guest, checking out a visitor by name, opening a visitor badge, toggling the interface theme, exporting data to CSV, and logging out. The command palette enables experienced users to operate the system efficiently without relying on the standard navigation menus.</w:t>
+      </w:r>
+    </w:p>
+    <w:p>
+      <w:pPr>
+        <w:pStyle w:val="Heading3"/>
+      </w:pPr>
+      <w:r>
+        <w:rPr>
+          <w:b/>
+        </w:rPr>
+        <w:t>Figure 4.6: Implemented Keyboard Command Palette Interface</w:t>
+      </w:r>
+    </w:p>
+    <w:p>
+      <w:pPr>
+        <w:jc w:val="center"/>
+      </w:pPr>
+      <w:r>
+        <w:drawing>
+          <wp:inline>
+            <wp:extent cx="3657600" cy="3920700"/>
+            <wp:docPr id="9" name="Picture 9"/>
+            <wp:cNvGraphicFramePr>
+              <a:graphicFrameLocks noChangeAspect="1"/>
+            </wp:cNvGraphicFramePr>
+            <a:graphic>
+              <a:graphicData uri="http://schemas.openxmlformats.org/drawingml/2006/picture">
+                <pic:pic>
+                  <pic:nvPicPr>
+                    <pic:cNvPr id="0" name="command pallete.png"/>
+                    <pic:cNvPicPr/>
+                  </pic:nvPicPr>
+                  <pic:blipFill>
+                    <a:blip r:embed="rId14"/>
+                    <a:stretch>
+                      <a:fillRect/>
+                    </a:stretch>
+                  </pic:blipFill>
+                  <pic:spPr>
+                    <a:xfrm>
+                      <a:off x="0" y="0"/>
+                      <a:ext cx="3657600" cy="3920700"/>
+                    </a:xfrm>
+                    <a:prstGeom prst="rect"/>
+                  </pic:spPr>
+                </pic:pic>
+              </a:graphicData>
+            </a:graphic>
+          </wp:inline>
+        </w:drawing>
+      </w:r>
+    </w:p>
+    <w:p>
+      <w:pPr/>
+      <w:r>
+        <w:rPr>
+          <w:i/>
+        </w:rPr>
+        <w:t>Source: Author's Implementation (2026).</w:t>
+      </w:r>
+    </w:p>
+    <w:p>
+      <w:pPr/>
+      <w:r>
+        <w:t>Figure 4.6 demonstrates the command palette modal overlay offering rapid keyboard search, navigation shortcuts, and direct visitor check-out actions.</w:t>
+      </w:r>
+    </w:p>
+    <w:p>
+      <w:pPr>
+        <w:pStyle w:val="Heading1"/>
+      </w:pPr>
+      <w:r>
+        <w:t>4.23 Implementation of the Interface Theme Module</w:t>
+      </w:r>
+    </w:p>
+    <w:p>
+      <w:pPr/>
+      <w:r>
+        <w:t>The system supports both a light and a dark interface theme to accommodate different lighting environments and user preferences. The active theme is toggled through a control available in the header, the Settings view, and the command palette. The selected theme is persisted using browser local storage so that it is restored automatically on subsequent visits. The dark theme uses a neutral-950 background with adjusted component surface colours, while the light theme uses a gradient light-blue background. All components implement conditional styling that responds to the active theme.</w:t>
+      </w:r>
+    </w:p>
+    <w:p>
+      <w:pPr>
+        <w:pStyle w:val="Heading1"/>
         <w:keepNext w:val="0"/>
         <w:keepLines w:val="0"/>
         <w:spacing w:before="480" w:lineRule="auto"/>
@@ -18944,17 +19892,8 @@
           <w:szCs w:val="46"/>
         </w:rPr>
       </w:pPr>
-      <w:bookmarkStart w:colFirst="0" w:colLast="0" w:name="_8he79x54vqfk" w:id="157"/>
-      <w:bookmarkEnd w:id="157"/>
-      <w:r>
-        <w:rPr>
-          <w:b w:val="1"/>
-          <w:bCs w:val="1"/>
-          <w:sz w:val="46"/>
-          <w:szCs w:val="46"/>
-          <w:rtl w:val="0"/>
-        </w:rPr>
-        <w:t xml:space="preserve">4.14 System Testing</w:t>
+      <w:r>
+        <w:t>4.24 System Testing</w:t>
       </w:r>
     </w:p>
     <w:p>
@@ -19182,17 +20121,8 @@
           <w:szCs w:val="46"/>
         </w:rPr>
       </w:pPr>
-      <w:bookmarkStart w:colFirst="0" w:colLast="0" w:name="_ks94zr1fhow" w:id="158"/>
-      <w:bookmarkEnd w:id="158"/>
-      <w:r>
-        <w:rPr>
-          <w:b w:val="1"/>
-          <w:bCs w:val="1"/>
-          <w:sz w:val="46"/>
-          <w:szCs w:val="46"/>
-          <w:rtl w:val="0"/>
-        </w:rPr>
-        <w:t xml:space="preserve">4.15 Test Cases and Results</w:t>
+      <w:r>
+        <w:t>4.25 Test Cases and Results</w:t>
       </w:r>
     </w:p>
     <w:p>
@@ -21014,17 +21944,8 @@
           <w:szCs w:val="46"/>
         </w:rPr>
       </w:pPr>
-      <w:bookmarkStart w:colFirst="0" w:colLast="0" w:name="_uj80cqqrf9qa" w:id="160"/>
-      <w:bookmarkEnd w:id="160"/>
-      <w:r>
-        <w:rPr>
-          <w:b w:val="1"/>
-          <w:bCs w:val="1"/>
-          <w:sz w:val="46"/>
-          <w:szCs w:val="46"/>
-          <w:rtl w:val="0"/>
-        </w:rPr>
-        <w:t xml:space="preserve">4.16 Registration and Check-Out Test</w:t>
+      <w:r>
+        <w:t>4.26 Registration and Check-Out Test</w:t>
       </w:r>
     </w:p>
     <w:p>
@@ -21262,17 +22183,8 @@
           <w:szCs w:val="46"/>
         </w:rPr>
       </w:pPr>
-      <w:bookmarkStart w:colFirst="0" w:colLast="0" w:name="_bfindxvjtdlw" w:id="161"/>
-      <w:bookmarkEnd w:id="161"/>
-      <w:r>
-        <w:rPr>
-          <w:b w:val="1"/>
-          <w:bCs w:val="1"/>
-          <w:sz w:val="46"/>
-          <w:szCs w:val="46"/>
-          <w:rtl w:val="0"/>
-        </w:rPr>
-        <w:t xml:space="preserve">4.17 Search Function Test</w:t>
+      <w:r>
+        <w:t>4.27 Search Function Test</w:t>
       </w:r>
     </w:p>
     <w:p>
@@ -21352,17 +22264,8 @@
           <w:szCs w:val="46"/>
         </w:rPr>
       </w:pPr>
-      <w:bookmarkStart w:colFirst="0" w:colLast="0" w:name="_jhld819z00cz" w:id="162"/>
-      <w:bookmarkEnd w:id="162"/>
-      <w:r>
-        <w:rPr>
-          <w:b w:val="1"/>
-          <w:bCs w:val="1"/>
-          <w:sz w:val="46"/>
-          <w:szCs w:val="46"/>
-          <w:rtl w:val="0"/>
-        </w:rPr>
-        <w:t xml:space="preserve">4.18 Report Generation Test</w:t>
+      <w:r>
+        <w:t>4.28 Report Generation Test</w:t>
       </w:r>
     </w:p>
     <w:p>
@@ -21442,17 +22345,8 @@
           <w:szCs w:val="46"/>
         </w:rPr>
       </w:pPr>
-      <w:bookmarkStart w:colFirst="0" w:colLast="0" w:name="_9w21abldy4k5" w:id="163"/>
-      <w:bookmarkEnd w:id="163"/>
-      <w:r>
-        <w:rPr>
-          <w:b w:val="1"/>
-          <w:bCs w:val="1"/>
-          <w:sz w:val="46"/>
-          <w:szCs w:val="46"/>
-          <w:rtl w:val="0"/>
-        </w:rPr>
-        <w:t xml:space="preserve">4.19 Security Considerations</w:t>
+      <w:r>
+        <w:t>4.29 Security Considerations</w:t>
       </w:r>
     </w:p>
     <w:p>
@@ -21720,17 +22614,8 @@
           <w:szCs w:val="46"/>
         </w:rPr>
       </w:pPr>
-      <w:bookmarkStart w:colFirst="0" w:colLast="0" w:name="_v9wo1ggy3vt" w:id="169"/>
-      <w:bookmarkEnd w:id="169"/>
-      <w:r>
-        <w:rPr>
-          <w:b w:val="1"/>
-          <w:bCs w:val="1"/>
-          <w:sz w:val="46"/>
-          <w:szCs w:val="46"/>
-          <w:rtl w:val="0"/>
-        </w:rPr>
-        <w:t xml:space="preserve">4.20 Discussion of Implementation Results</w:t>
+      <w:r>
+        <w:t>4.30 Discussion of Implementation Results</w:t>
       </w:r>
     </w:p>
     <w:p>
@@ -21822,17 +22707,8 @@
           <w:szCs w:val="46"/>
         </w:rPr>
       </w:pPr>
-      <w:bookmarkStart w:colFirst="0" w:colLast="0" w:name="_rtqowywkllm4" w:id="170"/>
-      <w:bookmarkEnd w:id="170"/>
-      <w:r>
-        <w:rPr>
-          <w:b w:val="1"/>
-          <w:bCs w:val="1"/>
-          <w:sz w:val="46"/>
-          <w:szCs w:val="46"/>
-          <w:rtl w:val="0"/>
-        </w:rPr>
-        <w:t xml:space="preserve">4.21 Limitations of the Implemented Prototype</w:t>
+      <w:r>
+        <w:t>4.31 Limitations of the Implemented Prototype</w:t>
       </w:r>
     </w:p>
     <w:p>
@@ -21856,55 +22732,55 @@
         <w:rPr>
           <w:rtl w:val="0"/>
         </w:rPr>
-        <w:t xml:space="preserve">First, the prototype uses browser-based storage for demonstration purposes rather than a remotely hosted production database.</w:t>
-      </w:r>
-    </w:p>
-    <w:p>
-      <w:pPr>
-        <w:spacing w:after="240" w:before="240" w:lineRule="auto"/>
-        <w:rPr/>
-      </w:pPr>
-      <w:r>
-        <w:rPr>
-          <w:rtl w:val="0"/>
-        </w:rPr>
-        <w:t xml:space="preserve">Second, it does not implement biometric identification such as fingerprint or facial recognition. Such technologies would require additional hardware and software infrastructure.</w:t>
-      </w:r>
-    </w:p>
-    <w:p>
-      <w:pPr>
-        <w:spacing w:after="240" w:before="240" w:lineRule="auto"/>
-        <w:rPr/>
-      </w:pPr>
-      <w:r>
-        <w:rPr>
-          <w:rtl w:val="0"/>
-        </w:rPr>
-        <w:t xml:space="preserve">Third, the prototype does not provide SMS or email notifications.</w:t>
-      </w:r>
-    </w:p>
-    <w:p>
-      <w:pPr>
-        <w:spacing w:after="240" w:before="240" w:lineRule="auto"/>
-        <w:rPr/>
-      </w:pPr>
-      <w:r>
-        <w:rPr>
-          <w:rtl w:val="0"/>
-        </w:rPr>
-        <w:t xml:space="preserve">Fourth, it is not connected to an organization's existing access-control infrastructure.</w:t>
-      </w:r>
-    </w:p>
-    <w:p>
-      <w:pPr>
-        <w:spacing w:after="240" w:before="240" w:lineRule="auto"/>
-        <w:rPr/>
-      </w:pPr>
-      <w:r>
-        <w:rPr>
-          <w:rtl w:val="0"/>
-        </w:rPr>
-        <w:t xml:space="preserve">Fifth, the current reporting functionality is basic and can be expanded in a future version.</w:t>
+        <w:t>First, the system does not currently implement email or SMS notification services. Notifying a host employee when their visitor arrives requires manual communication.</w:t>
+      </w:r>
+    </w:p>
+    <w:p>
+      <w:pPr>
+        <w:spacing w:after="240" w:before="240" w:lineRule="auto"/>
+        <w:rPr/>
+      </w:pPr>
+      <w:r>
+        <w:rPr>
+          <w:rtl w:val="0"/>
+        </w:rPr>
+        <w:t>Second, the system does not implement biometric identification such as fingerprint or facial recognition. Visitor identity is verified through an identification number provided at registration and encoded in the QR-code visitor badge.</w:t>
+      </w:r>
+    </w:p>
+    <w:p>
+      <w:pPr>
+        <w:spacing w:after="240" w:before="240" w:lineRule="auto"/>
+        <w:rPr/>
+      </w:pPr>
+      <w:r>
+        <w:rPr>
+          <w:rtl w:val="0"/>
+        </w:rPr>
+        <w:t>Third, the system is not integrated with physical access-control infrastructure such as electronic doors or turnstile systems.</w:t>
+      </w:r>
+    </w:p>
+    <w:p>
+      <w:pPr>
+        <w:spacing w:after="240" w:before="240" w:lineRule="auto"/>
+        <w:rPr/>
+      </w:pPr>
+      <w:r>
+        <w:rPr>
+          <w:rtl w:val="0"/>
+        </w:rPr>
+        <w:t>Fourth, the reporting module does not yet support scheduled or automated report delivery. Reports must be generated and exported manually by an administrator.</w:t>
+      </w:r>
+    </w:p>
+    <w:p>
+      <w:pPr>
+        <w:spacing w:after="240" w:before="240" w:lineRule="auto"/>
+        <w:rPr/>
+      </w:pPr>
+      <w:r>
+        <w:rPr>
+          <w:rtl w:val="0"/>
+        </w:rPr>
+        <w:t>Fifth, the visitor badge QR code currently encodes a JSON payload for manual scanning. Integration with a dedicated badge-scanning terminal or access-control device is not yet implemented.</w:t>
       </w:r>
     </w:p>
     <w:p>
@@ -21948,53 +22824,44 @@
           <w:szCs w:val="46"/>
         </w:rPr>
       </w:pPr>
-      <w:bookmarkStart w:colFirst="0" w:colLast="0" w:name="_xm9nlw85g6b3" w:id="171"/>
-      <w:bookmarkEnd w:id="171"/>
-      <w:r>
-        <w:rPr>
-          <w:b w:val="1"/>
-          <w:bCs w:val="1"/>
-          <w:sz w:val="46"/>
-          <w:szCs w:val="46"/>
-          <w:rtl w:val="0"/>
-        </w:rPr>
-        <w:t xml:space="preserve">4.22 Summary of Chapter Four</w:t>
-      </w:r>
-    </w:p>
-    <w:p>
-      <w:pPr>
-        <w:spacing w:after="240" w:before="240" w:lineRule="auto"/>
-        <w:rPr/>
-      </w:pPr>
-      <w:r>
-        <w:rPr>
-          <w:rtl w:val="0"/>
-        </w:rPr>
-        <w:t xml:space="preserve">This chapter presented the implementation and testing of the Computerized Guest Information Tracking System. The proposed design from Chapter Three was translated into a functional prototype containing a dashboard, guest registration, check-in, guest records, search, check-out, visitor status tracking, reporting, and data export functions.</w:t>
-      </w:r>
-    </w:p>
-    <w:p>
-      <w:pPr>
-        <w:spacing w:after="240" w:before="240" w:lineRule="auto"/>
-        <w:rPr/>
-      </w:pPr>
-      <w:r>
-        <w:rPr>
-          <w:rtl w:val="0"/>
-        </w:rPr>
-        <w:t xml:space="preserve">Screenshots of the implemented interfaces were presented to demonstrate the appearance and operation of the system. Functional testing was also conducted on the major system components.</w:t>
-      </w:r>
-    </w:p>
-    <w:p>
-      <w:pPr>
-        <w:spacing w:after="240" w:before="240" w:lineRule="auto"/>
-        <w:rPr/>
-      </w:pPr>
-      <w:r>
-        <w:rPr>
-          <w:rtl w:val="0"/>
-        </w:rPr>
-        <w:t xml:space="preserve">The results of the testing showed that the core functions of the prototype performed their intended operations. Guest records could be created, searched, updated through check-out, and used to generate visitor statistics and reports.</w:t>
+      <w:r>
+        <w:t>4.32 Summary of Chapter Four</w:t>
+      </w:r>
+    </w:p>
+    <w:p>
+      <w:pPr>
+        <w:spacing w:after="240" w:before="240" w:lineRule="auto"/>
+        <w:rPr/>
+      </w:pPr>
+      <w:r>
+        <w:rPr>
+          <w:rtl w:val="0"/>
+        </w:rPr>
+        <w:t>This chapter presented the implementation and testing of the Computerized Visitor Management System (VSMS). The prototype was developed as a full-stack web application using React, Node.js, and Supabase. It provides a substantially expanded set of functions compared with a basic visitor register, including multi-organization tenancy, role-based access control, a dynamic form builder, a real-time live presence board, QR-code visitor passes, a departments and host directory, advanced analytics, an audit log, a keyboard command palette, and a configurable interface theme.</w:t>
+      </w:r>
+    </w:p>
+    <w:p>
+      <w:pPr>
+        <w:spacing w:after="240" w:before="240" w:lineRule="auto"/>
+        <w:rPr/>
+      </w:pPr>
+      <w:r>
+        <w:rPr>
+          <w:rtl w:val="0"/>
+        </w:rPr>
+        <w:t>The implementation was guided by the system architecture, database design, and functional requirements described in Chapter Three, with additional modules developed to extend the system beyond the minimum prototype scope. Functional testing was conducted on all major modules.</w:t>
+      </w:r>
+    </w:p>
+    <w:p>
+      <w:pPr>
+        <w:spacing w:after="240" w:before="240" w:lineRule="auto"/>
+        <w:rPr/>
+      </w:pPr>
+      <w:r>
+        <w:rPr>
+          <w:rtl w:val="0"/>
+        </w:rPr>
+        <w:t>The results of the testing showed that all implemented functions performed their intended operations. Visitor registration, check-in, check-out, search, badge generation, analytics aggregation, role enforcement, and audit logging were all verified to operate correctly.</w:t>
       </w:r>
     </w:p>
     <w:p>
@@ -22498,7 +23365,7 @@
         <w:rPr>
           <w:rtl w:val="0"/>
         </w:rPr>
-        <w:t xml:space="preserve">A functional prototype was developed to demonstrate the major activities of the proposed computerized guest information tracking system. The prototype included:</w:t>
+        <w:t>A full-stack prototype was developed to demonstrate a comprehensive set of computerized visitor management activities. The implemented features include:</w:t>
       </w:r>
     </w:p>
     <w:p>
@@ -22647,6 +23514,86 @@
     </w:p>
     <w:p>
       <w:pPr>
+        <w:pStyle w:val="Normal"/>
+      </w:pPr>
+      <w:r>
+        <w:t>Multi-organization tenancy and a guided setup wizard.</w:t>
+      </w:r>
+    </w:p>
+    <w:p>
+      <w:pPr>
+        <w:pStyle w:val="Normal"/>
+      </w:pPr>
+      <w:r>
+        <w:t>Role-based access control with Administrator and Receptionist roles.</w:t>
+      </w:r>
+    </w:p>
+    <w:p>
+      <w:pPr>
+        <w:pStyle w:val="Normal"/>
+      </w:pPr>
+      <w:r>
+        <w:t>A dynamic visitor registration form builder with nine configurable field types.</w:t>
+      </w:r>
+    </w:p>
+    <w:p>
+      <w:pPr>
+        <w:pStyle w:val="Normal"/>
+      </w:pPr>
+      <w:r>
+        <w:t>A live real-time presence board with elapsed duration and overdue detection.</w:t>
+      </w:r>
+    </w:p>
+    <w:p>
+      <w:pPr>
+        <w:pStyle w:val="Normal"/>
+      </w:pPr>
+      <w:r>
+        <w:t>A QR-code visitor pass and badge printing module.</w:t>
+      </w:r>
+    </w:p>
+    <w:p>
+      <w:pPr>
+        <w:pStyle w:val="Normal"/>
+      </w:pPr>
+      <w:r>
+        <w:t>A departments and host staff directory with visitor traffic statistics.</w:t>
+      </w:r>
+    </w:p>
+    <w:p>
+      <w:pPr>
+        <w:pStyle w:val="Normal"/>
+      </w:pPr>
+      <w:r>
+        <w:t>An advanced analytics dashboard with time-range filtering and visit breakdown metrics.</w:t>
+      </w:r>
+    </w:p>
+    <w:p>
+      <w:pPr>
+        <w:pStyle w:val="Normal"/>
+      </w:pPr>
+      <w:r>
+        <w:t>An audit log recording all administrative actions.</w:t>
+      </w:r>
+    </w:p>
+    <w:p>
+      <w:pPr>
+        <w:pStyle w:val="Normal"/>
+      </w:pPr>
+      <w:r>
+        <w:t>A keyboard command palette for rapid navigation and action.</w:t>
+      </w:r>
+    </w:p>
+    <w:p>
+      <w:pPr>
+        <w:pStyle w:val="Normal"/>
+      </w:pPr>
+      <w:r>
+        <w:t>Dark and light interface theming with session persistence.</w:t>
+      </w:r>
+    </w:p>
+    <w:p>
+      <w:pPr>
         <w:spacing w:after="240" w:before="240" w:lineRule="auto"/>
         <w:rPr/>
       </w:pPr>
@@ -23558,7 +24505,7 @@
         <w:rPr>
           <w:rtl w:val="0"/>
         </w:rPr>
-        <w:t xml:space="preserve">The implemented prototype demonstrated the core functions required for computerized guest information tracking. Visitors can be registered, their arrival can be recorded, information can be retrieved through the records interface, and their departure can subsequently be recorded. The system also provides basic statistical and reporting functionality.</w:t>
+        <w:t>The implemented system demonstrated a comprehensive set of functions for computerized visitor management. Beyond the core prototype requirements, the system incorporates multi-organization support, role-based access control, a dynamic form builder, real-time presence tracking, QR-code visitor passes, a departments and host directory, advanced analytics, an audit log, a keyboard command palette, and configurable theming. These capabilities position the system as a practical foundation for organizational deployment rather than merely an academic prototype.</w:t>
       </w:r>
     </w:p>
     <w:p>
@@ -23582,7 +24529,7 @@
         <w:rPr>
           <w:rtl w:val="0"/>
         </w:rPr>
-        <w:t xml:space="preserve">However, the prototype represents an academic implementation rather than a complete enterprise-level visitor management platform. Additional development would be required before deployment in an organization requiring centralized cloud storage, multiple administrative users, advanced authentication, biometric identification, integration with physical access-control systems, automated notifications, and comprehensive security controls.</w:t>
+        <w:t>The system remains open to further development. Areas for future enhancement include automated email and SMS arrival notifications, integration with physical access-control hardware, biometric visitor identification, and scheduled report delivery. These extensions would further increase the system's suitability for high-security organizational environments.</w:t>
       </w:r>
     </w:p>
     <w:p>
@@ -23728,19 +24675,19 @@
         <w:rPr>
           <w:rtl w:val="0"/>
         </w:rPr>
-        <w:t xml:space="preserve">For actual organizational deployment, the prototype should be connected to a centralized database such as MySQL or another appropriate relational database system.</w:t>
-      </w:r>
-    </w:p>
-    <w:p>
-      <w:pPr>
-        <w:spacing w:after="240" w:before="240" w:lineRule="auto"/>
-        <w:rPr/>
-      </w:pPr>
-      <w:r>
-        <w:rPr>
-          <w:rtl w:val="0"/>
-        </w:rPr>
-        <w:t xml:space="preserve">A centralized database would allow authorized users to access visitor information from different workstations while maintaining a common source of records.</w:t>
+        <w:t>The implemented system is connected to Supabase, a hosted PostgreSQL service that provides centralized cloud database storage. This recommendation has been addressed in the current implementation. Future versions may consider replication strategies or offline-first sync for environments with unreliable internet connectivity.</w:t>
+      </w:r>
+    </w:p>
+    <w:p>
+      <w:pPr>
+        <w:spacing w:after="240" w:before="240" w:lineRule="auto"/>
+        <w:rPr/>
+      </w:pPr>
+      <w:r>
+        <w:rPr>
+          <w:rtl w:val="0"/>
+        </w:rPr>
+        <w:t>The Supabase database allows authorized administrators to access visitor information from any device with a browser and internet connection. A local SQLite fallback is also available for offline use.</w:t>
       </w:r>
     </w:p>
     <w:p>
@@ -23780,19 +24727,19 @@
         <w:rPr>
           <w:rtl w:val="0"/>
         </w:rPr>
-        <w:t xml:space="preserve">The production version of the system should include secure administrator authentication.</w:t>
-      </w:r>
-    </w:p>
-    <w:p>
-      <w:pPr>
-        <w:spacing w:after="240" w:before="240" w:lineRule="auto"/>
-        <w:rPr/>
-      </w:pPr>
-      <w:r>
-        <w:rPr>
-          <w:rtl w:val="0"/>
-        </w:rPr>
-        <w:t xml:space="preserve">Different categories of users can be assigned appropriate permissions. For example, a security officer may register and check out visitors, while an administrator may have access to reports and historical records.</w:t>
+        <w:t>The implemented system includes password-hashed administrator authentication and a two-role access control model. Administrators have full system access, while Receptionist accounts are provisioned by the administrator with restricted permissions. This recommendation has been addressed in the current implementation.</w:t>
+      </w:r>
+    </w:p>
+    <w:p>
+      <w:pPr>
+        <w:spacing w:after="240" w:before="240" w:lineRule="auto"/>
+        <w:rPr/>
+      </w:pPr>
+      <w:r>
+        <w:rPr>
+          <w:rtl w:val="0"/>
+        </w:rPr>
+        <w:t>Future versions may extend the role system to include additional roles such as department manager or read-only auditor, each with a tailored permission set.</w:t>
       </w:r>
     </w:p>
     <w:p>
@@ -23976,7 +24923,7 @@
         <w:rPr>
           <w:rtl w:val="0"/>
         </w:rPr>
-        <w:t xml:space="preserve">Future versions of the system may incorporate technologies such as barcode or QR-code identification, identity-card scanning, fingerprint recognition, or facial recognition where legally and operationally appropriate.</w:t>
+        <w:t>The current implementation generates a QR-code visitor badge for each registered guest. The QR code encodes the visitor's identity details and can be scanned for verification. This recommendation has been partially addressed. Future versions may incorporate identity-card scanning or biometric verification where legally and operationally appropriate.</w:t>
       </w:r>
     </w:p>
     <w:p>
@@ -24080,7 +25027,7 @@
         <w:rPr>
           <w:rtl w:val="0"/>
         </w:rPr>
-        <w:t xml:space="preserve">Future versions should provide more comprehensive reporting capabilities.</w:t>
+        <w:t>The implemented system provides an advanced analytics dashboard with time-range filtering, average visit duration calculation, identification compliance rate, top-department traffic breakdown, visit purpose distribution, and peak-hour analysis. CSV export is also available. This recommendation has been substantially addressed. Future versions may add scheduled report delivery and multi-period comparison charts.</w:t>
       </w:r>
     </w:p>
     <w:p>
@@ -24350,7 +25297,7 @@
         <w:rPr>
           <w:rtl w:val="0"/>
         </w:rPr>
-        <w:t xml:space="preserve">Future work could develop a cloud-based version that allows authorized administrators to securely access visitor records from multiple locations.</w:t>
+        <w:t>The current system is deployed as a cloud-based web application using Supabase for data storage, making visitor records accessible from any authorized device. Future research could extend this by adding offline-first synchronization capabilities for deployment in environments with intermittent internet connectivity.</w:t>
       </w:r>
     </w:p>
     <w:p>
@@ -24510,7 +25457,7 @@
         <w:rPr>
           <w:rtl w:val="0"/>
         </w:rPr>
-        <w:t xml:space="preserve">Future researchers could investigate the use of data analytics to identify visitor patterns, peak visiting periods, frequently visited departments, and other useful organizational trends.</w:t>
+        <w:t>The current system implements visitor pattern analytics including peak visiting period identification, top-department traffic analysis, and visit duration statistics. Future research could extend this by applying machine learning techniques to forecast visitor volumes or detect anomalous access patterns.</w:t>
       </w:r>
     </w:p>
     <w:p>
@@ -24550,7 +25497,7 @@
         <w:rPr>
           <w:rtl w:val="0"/>
         </w:rPr>
-        <w:t xml:space="preserve">Further studies could examine how the system can be adapted for environments with multiple branches, departments, buildings, or locations while maintaining centralized visitor records.</w:t>
+        <w:t>The current system supports multi-organization deployment, allowing multiple independent organizations to be managed from a single system instance with fully isolated records. Future studies could investigate federation across geographically distributed branches, with centralized reporting and cross-location visitor tracking.</w:t>
       </w:r>
     </w:p>
     <w:p>
@@ -24628,7 +25575,7 @@
         <w:rPr>
           <w:rtl w:val="0"/>
         </w:rPr>
-        <w:t xml:space="preserve">The study also provides a foundation that can be extended with more advanced technologies such as cloud databases, mobile applications, biometric identification, automated notifications, and integration with organizational access-control systems.</w:t>
+        <w:t>Beyond the foundational prototype, the study contributes a practical, deployable system that extends the baseline requirements to include multi-tenancy, configurable form fields, real-time visitor status monitoring, QR-code badge generation, advanced analytics, and a comprehensive audit trail. These additions demonstrate how a core visitor management prototype can be evolved into a production-ready organizational tool while remaining grounded in the academic objectives of the study.</w:t>
       </w:r>
     </w:p>
     <w:p>
@@ -24706,19 +25653,19 @@
         <w:rPr>
           <w:rtl w:val="0"/>
         </w:rPr>
-        <w:t xml:space="preserve">The results indicate that the computerized approach can support structured guest registration, visitor tracking, record retrieval, check-out monitoring, and basic reporting. Although the prototype requires additional development before it can serve as a full-scale organizational deployment, it successfully demonstrates the fundamental principles and functionality of computerized guest information tracking.</w:t>
-      </w:r>
-    </w:p>
-    <w:p>
-      <w:pPr>
-        <w:spacing w:after="240" w:before="240" w:lineRule="auto"/>
-        <w:rPr/>
-      </w:pPr>
-      <w:r>
-        <w:rPr>
-          <w:rtl w:val="0"/>
-        </w:rPr>
-        <w:t xml:space="preserve">The study therefore concludes that the proposed system provides a practical foundation for improving the management of visitor information and can serve as a basis for future development of a more comprehensive visitor management solution.</w:t>
+        <w:t>The results indicate that the computerized approach can support structured guest registration, real-time visitor tracking, record retrieval, check-out monitoring, advanced reporting, and multi-organizational administration. The system successfully demonstrates these capabilities through a deployable full-stack web application.</w:t>
+      </w:r>
+    </w:p>
+    <w:p>
+      <w:pPr>
+        <w:spacing w:after="240" w:before="240" w:lineRule="auto"/>
+        <w:rPr/>
+      </w:pPr>
+      <w:r>
+        <w:rPr>
+          <w:rtl w:val="0"/>
+        </w:rPr>
+        <w:t>The study therefore concludes that the implemented system provides a practical and extensible foundation for improving the management of visitor information in organizational settings, and can serve as a basis for future development of a fully enterprise-grade visitor management solution.</w:t>
       </w:r>
     </w:p>
     <w:p>

</xml_diff>